<commit_message>
Remove all residual Holt-Winters references; SARIMA-only methodology + 2.7% MAPE across notebook, README & report
</commit_message>
<xml_diff>
--- a/reports/Walmart_Capstone_Report.docx
+++ b/reports/Walmart_Capstone_Report.docx
@@ -5877,7 +5877,7 @@
         <w:t xml:space="preserve">SARIMA wins. </w:t>
       </w:r>
       <w:r>
-        <w:t xml:space="preserve">Its mean 12-week MAPE of 2.73% beats ARIMA (3.80%) and improves on the earlier Holt-Winters baseline (4.33%), while correctly tracking the holiday surge that flat ARIMA misses.</w:t>
+        <w:t xml:space="preserve">Its mean 12-week MAPE of 2.73% beats a non-seasonal ARIMA (3.80%), while correctly tracking the holiday surge that a non-seasonal ARIMA misses.</w:t>
       </w:r>
     </w:p>
     <w:p>
@@ -6967,7 +6967,7 @@
         <w:t xml:space="preserve">Forecasting (revised): </w:t>
       </w:r>
       <w:r>
-        <w:t xml:space="preserve">each store is forecast with SARIMA (seasonal ARIMA, m = 52), validated by a 12-week backtest (mean MAPE ≈ 2.7%, beating ARIMA and Holt-Winters). A 12-week forecast with confidence bands is produced for all 45 stores for inventory planning.</w:t>
+        <w:t xml:space="preserve">each store is forecast with SARIMA (seasonal ARIMA, m = 52), validated by a 12-week backtest (mean MAPE ≈ 2.7%, beating a non-seasonal ARIMA). A 12-week forecast with confidence bands is produced for all 45 stores for inventory planning.</w:t>
       </w:r>
     </w:p>
     <w:p>

</xml_diff>